<commit_message>
Update docs and gitignore
</commit_message>
<xml_diff>
--- a/docs/vsca11y_Dokumentacija.docx
+++ b/docs/vsca11y_Dokumentacija.docx
@@ -4708,7 +4708,7 @@
           <w:szCs w:val="28"/>
         </w:rPr>
         <w:pict w14:anchorId="660EE678">
-          <v:rect id="_x0000_i1029" style="width:0;height:1.5pt" o:hralign="center" o:hrstd="t" o:hr="t" fillcolor="#a0a0a0" stroked="f"/>
+          <v:rect id="_x0000_i1025" style="width:0;height:1.5pt" o:hralign="center" o:hrstd="t" o:hr="t" fillcolor="#a0a0a0" stroked="f"/>
         </w:pict>
       </w:r>
       <w:r>
@@ -7986,22 +7986,99 @@
           <w:sz w:val="28"/>
           <w:szCs w:val="28"/>
         </w:rPr>
-        <w:t>Neke od ideja su nam prilagođavanje za više vrsta daltonizma, napraviti setova postavki koje vi možete mijenjati. Tako bi mogli napraviti više setova i mijenjati između tih setova po onome što odgovara. Također bi dodali način na koji možete podijeliti svoj set sa nekime, naprimjer putem koda kojeg ta osoba može iskoristit kako bi automatski postavila taj set postavki.</w:t>
-      </w:r>
-    </w:p>
-    <w:p>
-      <w:pPr>
-        <w:rPr>
-          <w:sz w:val="28"/>
-          <w:szCs w:val="28"/>
-        </w:rPr>
-      </w:pPr>
-      <w:r>
-        <w:rPr>
-          <w:sz w:val="28"/>
-          <w:szCs w:val="28"/>
-        </w:rPr>
-        <w:t>Također bi pokušali napraviti opciju da se pritiskom gumba</w:t>
+        <w:t>Neke od ideja su nam prilagođavanje za više vrsta daltonizma</w:t>
+      </w:r>
+      <w:r>
+        <w:rPr>
+          <w:sz w:val="28"/>
+          <w:szCs w:val="28"/>
+        </w:rPr>
+        <w:t xml:space="preserve"> i</w:t>
+      </w:r>
+      <w:r>
+        <w:rPr>
+          <w:sz w:val="28"/>
+          <w:szCs w:val="28"/>
+        </w:rPr>
+        <w:t xml:space="preserve"> napraviti setov</w:t>
+      </w:r>
+      <w:r>
+        <w:rPr>
+          <w:sz w:val="28"/>
+          <w:szCs w:val="28"/>
+        </w:rPr>
+        <w:t>e</w:t>
+      </w:r>
+      <w:r>
+        <w:rPr>
+          <w:sz w:val="28"/>
+          <w:szCs w:val="28"/>
+        </w:rPr>
+        <w:t xml:space="preserve"> postavki koje vi možete mijenjati. Tako bi mogli napraviti više setova i mijenjati između tih setova po onome što odgovara</w:t>
+      </w:r>
+      <w:r>
+        <w:rPr>
+          <w:sz w:val="28"/>
+          <w:szCs w:val="28"/>
+        </w:rPr>
+        <w:t xml:space="preserve"> trenutku</w:t>
+      </w:r>
+      <w:r>
+        <w:rPr>
+          <w:sz w:val="28"/>
+          <w:szCs w:val="28"/>
+        </w:rPr>
+        <w:t>. Također bi dodali način na koji možete podijeliti svoj set sa nekime, naprimjer putem koda kojeg ta osoba može iskoristit</w:t>
+      </w:r>
+      <w:r>
+        <w:rPr>
+          <w:sz w:val="28"/>
+          <w:szCs w:val="28"/>
+        </w:rPr>
+        <w:t>i</w:t>
+      </w:r>
+      <w:r>
+        <w:rPr>
+          <w:sz w:val="28"/>
+          <w:szCs w:val="28"/>
+        </w:rPr>
+        <w:t xml:space="preserve"> kako bi automatski postavila taj set postavki.</w:t>
+      </w:r>
+    </w:p>
+    <w:p>
+      <w:pPr>
+        <w:rPr>
+          <w:sz w:val="28"/>
+          <w:szCs w:val="28"/>
+        </w:rPr>
+      </w:pPr>
+      <w:r>
+        <w:rPr>
+          <w:sz w:val="28"/>
+          <w:szCs w:val="28"/>
+        </w:rPr>
+        <w:t>Također bi</w:t>
+      </w:r>
+      <w:r>
+        <w:rPr>
+          <w:sz w:val="28"/>
+          <w:szCs w:val="28"/>
+        </w:rPr>
+        <w:t>smo</w:t>
+      </w:r>
+      <w:r>
+        <w:rPr>
+          <w:sz w:val="28"/>
+          <w:szCs w:val="28"/>
+        </w:rPr>
+        <w:t xml:space="preserve"> pokušali napraviti opciju da se pritiskom gumba</w:t>
+      </w:r>
+      <w:r>
+        <w:rPr>
+          <w:sz w:val="28"/>
+          <w:szCs w:val="28"/>
+        </w:rPr>
+        <w:t xml:space="preserve"> </w:t>
       </w:r>
       <w:r>
         <w:rPr>
@@ -8023,7 +8100,36 @@
           <w:sz w:val="28"/>
           <w:szCs w:val="28"/>
         </w:rPr>
-        <w:t xml:space="preserve">Također bi htjeli napraviti da možete birati između fontova koje želite upotrijebiti u slučaju da vam je trenutni nejasan. </w:t>
+        <w:t>Također bi</w:t>
+      </w:r>
+      <w:r>
+        <w:rPr>
+          <w:sz w:val="28"/>
+          <w:szCs w:val="28"/>
+        </w:rPr>
+        <w:t>smo</w:t>
+      </w:r>
+      <w:r>
+        <w:rPr>
+          <w:sz w:val="28"/>
+          <w:szCs w:val="28"/>
+        </w:rPr>
+        <w:t xml:space="preserve"> htjeli napraviti da možete birati između fontova koje želite upotrijebiti u slučaju da vam je trenutni nejasan. </w:t>
+      </w:r>
+    </w:p>
+    <w:p>
+      <w:pPr>
+        <w:rPr>
+          <w:sz w:val="28"/>
+          <w:szCs w:val="28"/>
+        </w:rPr>
+      </w:pPr>
+      <w:r>
+        <w:rPr>
+          <w:sz w:val="28"/>
+          <w:szCs w:val="28"/>
+        </w:rPr>
+        <w:t>Našu ekstenziju bismo htjeli podijeliti s većim brojem ljudi kako bi im ona potencijalno pomogla pri njihovom službenom poslu. Jedna od tih osoba koja ekstenziju već koristi na poslu je i naš mentor.</w:t>
       </w:r>
     </w:p>
     <w:p>
@@ -11535,8 +11641,10 @@
     <w:rsid w:val="003C6DEF"/>
     <w:rsid w:val="003F0C30"/>
     <w:rsid w:val="004B49B9"/>
+    <w:rsid w:val="005B6B80"/>
     <w:rsid w:val="0064196C"/>
     <w:rsid w:val="00672845"/>
+    <w:rsid w:val="007F4A2B"/>
     <w:rsid w:val="00806B27"/>
     <w:rsid w:val="0097666F"/>
     <w:rsid w:val="00A02D78"/>

</xml_diff>